<commit_message>
fix: address Oracle QA findings for submission package
- server/dotenv.ts: strip optional `export ` prefix so `export KEY=value`
  lines in .env load correctly (TDD: +1 test, now 50 total)
- docs/submission/README.md: reproduction uses `npm run build && npm run serve`
  (BFF + /api), not `npm run preview` (UI-only, no LLM endpoint); add `.env` step
- Regenerate both source zips WITHOUT stale compiled artifacts
  (vite.config.js / vite.config.d.ts); verified only vite.config.ts present
- Sync test-count 49->50 across README + submission docs; regenerate
  별첨3 AI evidence docx via pandoc (verified 50개, no stale count)
- Regenerate build-test-log (50 tests)
</commit_message>
<xml_diff>
--- a/docs/submission/제출본/별첨3_AI증빙자료.docx
+++ b/docs/submission/제출본/별첨3_AI증빙자료.docx
@@ -758,7 +758,7 @@
         <w:pStyle w:val="Compact"/>
       </w:pPr>
       <w:r>
-        <w:t xml:space="preserve">관련 테스트 5개 작성 및 전체 49개 테스트 통과.</w:t>
+        <w:t xml:space="preserve">관련 테스트 5개 작성 및 전체 50개 테스트 통과.</w:t>
       </w:r>
     </w:p>
     <w:p>
@@ -1267,7 +1267,7 @@
               <w:jc w:val="left"/>
             </w:pPr>
             <w:r>
-              <w:t xml:space="preserve">49개 테스트 통과, 빌드 성공</w:t>
+              <w:t xml:space="preserve">50개 테스트 통과, 빌드 성공</w:t>
             </w:r>
           </w:p>
         </w:tc>

</xml_diff>